<commit_message>
A23: test_audit.py talaba tuzatish faylini qabul qiladi, yechimsiz ham ishlaydi
Co-Authored-By: Claude Opus 5.5 <noreply@anthropic.com>
Claude-Session: https://claude.ai/code/session_01211J4GhAPU473avPFqaNRY
</commit_message>
<xml_diff>
--- a/A23/A23 - Smart-kontraktlarda zaifliklarni aniqlash va xavfsizlik auditini o‘tkazish.docx
+++ b/A23/A23 - Smart-kontraktlarda zaifliklarni aniqlash va xavfsizlik auditini o‘tkazish.docx
@@ -470,15 +470,15 @@
           <w:sz w:val="24"/>
           <w:szCs w:val="24"/>
         </w:rPr>
-        <w:t xml:space="preserve">Tuzatilgan.sol</w:t>
-      </w:r>
-      <w:r>
-        <w:rPr>
-          <w:rFonts w:ascii="Times New Roman" w:cs="Times New Roman" w:eastAsia="Times New Roman" w:hAnsi="Times New Roman"/>
-          <w:sz w:val="26"/>
-          <w:szCs w:val="26"/>
-        </w:rPr>
-        <w:t xml:space="preserve"> (faqat o'qituvchida), </w:t>
+        <w:t xml:space="preserve">test_audit.py</w:t>
+      </w:r>
+      <w:r>
+        <w:rPr>
+          <w:rFonts w:ascii="Times New Roman" w:cs="Times New Roman" w:eastAsia="Times New Roman" w:hAnsi="Times New Roman"/>
+          <w:sz w:val="26"/>
+          <w:szCs w:val="26"/>
+        </w:rPr>
+        <w:t xml:space="preserve">; </w:t>
       </w:r>
       <w:r>
         <w:rPr>
@@ -486,7 +486,15 @@
           <w:sz w:val="24"/>
           <w:szCs w:val="24"/>
         </w:rPr>
-        <w:t xml:space="preserve">test_audit.py</w:t>
+        <w:t xml:space="preserve">Tuzatilgan.sol</w:t>
+      </w:r>
+      <w:r>
+        <w:rPr>
+          <w:rFonts w:ascii="Times New Roman" w:cs="Times New Roman" w:eastAsia="Times New Roman" w:hAnsi="Times New Roman"/>
+          <w:sz w:val="26"/>
+          <w:szCs w:val="26"/>
+        </w:rPr>
+        <w:t xml:space="preserve"> — faqat o'qituvchida (talabalar arxivida yo'q)</w:t>
       </w:r>
     </w:p>
     <w:p>
@@ -2227,7 +2235,7 @@
           <w:sz w:val="26"/>
           <w:szCs w:val="26"/>
         </w:rPr>
-        <w:t xml:space="preserve">O'qituvchi bergan Tuzatilgan.sol bilan solishtiring yoki faylingizni test_audit.py ga ulab, to'liq testni ishga tushiring (</w:t>
+        <w:t xml:space="preserve">Tuzatishlaringizni bitta faylga yig'ing (kontrakt nomlari: BankTuzatilgan, HamyonTuzatilgan, TokenTuzatilgan, OmmaviyTuzatilgan, LotereyaTuzatilgan, AuksionTuzatilgan; LotereyaTuzatilgan konstruktori: </w:t>
       </w:r>
       <w:r>
         <w:rPr>
@@ -2235,15 +2243,31 @@
           <w:sz w:val="24"/>
           <w:szCs w:val="24"/>
         </w:rPr>
-        <w:t xml:space="preserve">python test_audit.py</w:t>
-      </w:r>
-      <w:r>
-        <w:rPr>
-          <w:rFonts w:ascii="Times New Roman" w:cs="Times New Roman" w:eastAsia="Times New Roman" w:hAnsi="Times New Roman"/>
-          <w:sz w:val="26"/>
-          <w:szCs w:val="26"/>
-        </w:rPr>
-        <w:t xml:space="preserve">) — natija 12/12.</w:t>
+        <w:t xml:space="preserve">(bytes32 sirXeshi, uint256 davomiylik)</w:t>
+      </w:r>
+      <w:r>
+        <w:rPr>
+          <w:rFonts w:ascii="Times New Roman" w:cs="Times New Roman" w:eastAsia="Times New Roman" w:hAnsi="Times New Roman"/>
+          <w:sz w:val="26"/>
+          <w:szCs w:val="26"/>
+        </w:rPr>
+        <w:t xml:space="preserve">) va </w:t>
+      </w:r>
+      <w:r>
+        <w:rPr>
+          <w:rFonts w:ascii="Courier New" w:cs="Courier New" w:eastAsia="Courier New" w:hAnsi="Courier New"/>
+          <w:sz w:val="24"/>
+          <w:szCs w:val="24"/>
+        </w:rPr>
+        <w:t xml:space="preserve">python test_audit.py MeningTuzatishim.sol</w:t>
+      </w:r>
+      <w:r>
+        <w:rPr>
+          <w:rFonts w:ascii="Times New Roman" w:cs="Times New Roman" w:eastAsia="Times New Roman" w:hAnsi="Times New Roman"/>
+          <w:sz w:val="26"/>
+          <w:szCs w:val="26"/>
+        </w:rPr>
+        <w:t xml:space="preserve"> bilan tekshiring — natija 12/12.</w:t>
       </w:r>
     </w:p>
     <w:p>

</xml_diff>